<commit_message>
updadted structure and added filter
</commit_message>
<xml_diff>
--- a/docs/Data Management Plan (DMP) form.docx
+++ b/docs/Data Management Plan (DMP) form.docx
@@ -495,64 +495,44 @@
                 <w:sz w:val="20"/>
                 <w:szCs w:val="20"/>
               </w:rPr>
-              <w:t xml:space="preserve">Aryan Sunil </w:t>
-            </w:r>
-            <w:proofErr w:type="spellStart"/>
-            <w:r>
-              <w:rPr>
-                <w:rFonts w:ascii="Verdana" w:hAnsi="Verdana" w:cstheme="minorHAnsi"/>
-                <w:sz w:val="20"/>
-                <w:szCs w:val="20"/>
-              </w:rPr>
-              <w:t>TheStudent</w:t>
-            </w:r>
-            <w:proofErr w:type="spellEnd"/>
-          </w:p>
-          <w:p>
-            <w:pPr>
-              <w:rPr>
-                <w:rFonts w:ascii="Verdana" w:hAnsi="Verdana" w:cstheme="minorHAnsi"/>
-                <w:sz w:val="20"/>
-                <w:szCs w:val="20"/>
-              </w:rPr>
-            </w:pPr>
-          </w:p>
-          <w:p>
-            <w:pPr>
-              <w:rPr>
-                <w:rFonts w:ascii="Verdana" w:hAnsi="Verdana" w:cstheme="minorHAnsi"/>
-                <w:sz w:val="20"/>
-                <w:szCs w:val="20"/>
-              </w:rPr>
-            </w:pPr>
-          </w:p>
-          <w:p>
-            <w:pPr>
-              <w:rPr>
-                <w:rFonts w:ascii="Verdana" w:hAnsi="Verdana" w:cstheme="minorHAnsi"/>
-                <w:b/>
-                <w:sz w:val="20"/>
-                <w:szCs w:val="20"/>
-              </w:rPr>
-            </w:pPr>
-            <w:r>
-              <w:rPr>
-                <w:rFonts w:ascii="Verdana" w:hAnsi="Verdana" w:cstheme="minorHAnsi"/>
-                <w:sz w:val="20"/>
-                <w:szCs w:val="20"/>
-              </w:rPr>
-              <w:t xml:space="preserve">Juan Martinez Avila </w:t>
-            </w:r>
-            <w:proofErr w:type="spellStart"/>
-            <w:r>
-              <w:rPr>
-                <w:rFonts w:ascii="Verdana" w:hAnsi="Verdana" w:cstheme="minorHAnsi"/>
-                <w:sz w:val="20"/>
-                <w:szCs w:val="20"/>
-              </w:rPr>
-              <w:t>TheSupervisor</w:t>
-            </w:r>
-            <w:proofErr w:type="spellEnd"/>
+              <w:t>Aryan Sunil TheStudent</w:t>
+            </w:r>
+          </w:p>
+          <w:p>
+            <w:pPr>
+              <w:rPr>
+                <w:rFonts w:ascii="Verdana" w:hAnsi="Verdana" w:cstheme="minorHAnsi"/>
+                <w:sz w:val="20"/>
+                <w:szCs w:val="20"/>
+              </w:rPr>
+            </w:pPr>
+          </w:p>
+          <w:p>
+            <w:pPr>
+              <w:rPr>
+                <w:rFonts w:ascii="Verdana" w:hAnsi="Verdana" w:cstheme="minorHAnsi"/>
+                <w:sz w:val="20"/>
+                <w:szCs w:val="20"/>
+              </w:rPr>
+            </w:pPr>
+          </w:p>
+          <w:p>
+            <w:pPr>
+              <w:rPr>
+                <w:rFonts w:ascii="Verdana" w:hAnsi="Verdana" w:cstheme="minorHAnsi"/>
+                <w:b/>
+                <w:sz w:val="20"/>
+                <w:szCs w:val="20"/>
+              </w:rPr>
+            </w:pPr>
+            <w:r>
+              <w:rPr>
+                <w:rFonts w:ascii="Verdana" w:hAnsi="Verdana" w:cstheme="minorHAnsi"/>
+                <w:sz w:val="20"/>
+                <w:szCs w:val="20"/>
+              </w:rPr>
+              <w:t>Juan Martinez Avila TheSupervisor</w:t>
+            </w:r>
           </w:p>
         </w:tc>
       </w:tr>
@@ -690,25 +670,7 @@
                 <w:sz w:val="20"/>
                 <w:szCs w:val="20"/>
               </w:rPr>
-              <w:t xml:space="preserve"> </w:t>
-            </w:r>
-            <w:proofErr w:type="spellStart"/>
-            <w:r>
-              <w:rPr>
-                <w:rFonts w:ascii="Verdana" w:hAnsi="Verdana" w:cstheme="minorHAnsi"/>
-                <w:sz w:val="20"/>
-                <w:szCs w:val="20"/>
-              </w:rPr>
-              <w:t>TheStudent</w:t>
-            </w:r>
-            <w:proofErr w:type="spellEnd"/>
-            <w:r>
-              <w:rPr>
-                <w:rFonts w:ascii="Verdana" w:hAnsi="Verdana" w:cstheme="minorHAnsi"/>
-                <w:sz w:val="20"/>
-                <w:szCs w:val="20"/>
-              </w:rPr>
-              <w:t xml:space="preserve"> will collect, process, manage and analyse and report the data.</w:t>
+              <w:t xml:space="preserve"> TheStudent will collect, process, manage and analyse and report the data.</w:t>
             </w:r>
           </w:p>
         </w:tc>
@@ -818,25 +780,7 @@
                 <w:sz w:val="20"/>
                 <w:szCs w:val="20"/>
               </w:rPr>
-              <w:t xml:space="preserve">Juan </w:t>
-            </w:r>
-            <w:proofErr w:type="spellStart"/>
-            <w:r>
-              <w:rPr>
-                <w:rFonts w:ascii="Verdana" w:hAnsi="Verdana" w:cstheme="minorHAnsi"/>
-                <w:sz w:val="20"/>
-                <w:szCs w:val="20"/>
-              </w:rPr>
-              <w:t>TheSupervisor</w:t>
-            </w:r>
-            <w:proofErr w:type="spellEnd"/>
-            <w:r>
-              <w:rPr>
-                <w:rFonts w:ascii="Verdana" w:hAnsi="Verdana" w:cstheme="minorHAnsi"/>
-                <w:sz w:val="20"/>
-                <w:szCs w:val="20"/>
-              </w:rPr>
-              <w:t xml:space="preserve"> may review the data and reports.</w:t>
+              <w:t>Juan TheSupervisor may review the data and reports.</w:t>
             </w:r>
           </w:p>
           <w:p>
@@ -1087,27 +1031,7 @@
                 <w:sz w:val="20"/>
                 <w:szCs w:val="20"/>
               </w:rPr>
-              <w:t xml:space="preserve">No personal data will be used or obtained. Dataset such as </w:t>
-            </w:r>
-            <w:proofErr w:type="spellStart"/>
-            <w:r>
-              <w:rPr>
-                <w:rFonts w:ascii="Verdana" w:hAnsi="Verdana" w:cstheme="minorHAnsi"/>
-                <w:bCs/>
-                <w:sz w:val="20"/>
-                <w:szCs w:val="20"/>
-              </w:rPr>
-              <w:t>GuitarSet</w:t>
-            </w:r>
-            <w:proofErr w:type="spellEnd"/>
-            <w:r>
-              <w:rPr>
-                <w:rFonts w:ascii="Verdana" w:hAnsi="Verdana" w:cstheme="minorHAnsi"/>
-                <w:bCs/>
-                <w:sz w:val="20"/>
-                <w:szCs w:val="20"/>
-              </w:rPr>
-              <w:t xml:space="preserve"> will be used for benchmarking purposes</w:t>
+              <w:t>No personal data will be used or obtained. Dataset such as GuitarSet will be used for benchmarking purposes</w:t>
             </w:r>
             <w:r>
               <w:rPr>
@@ -1865,7 +1789,7 @@
                 <w:sz w:val="20"/>
                 <w:szCs w:val="20"/>
               </w:rPr>
-              <w:t>N/A</w:t>
+              <w:t xml:space="preserve">Have a password set up on device </w:t>
             </w:r>
           </w:p>
           <w:p>
@@ -1993,7 +1917,7 @@
                 <w:szCs w:val="20"/>
               </w:rPr>
               <w:lastRenderedPageBreak/>
-              <w:t>N/A</w:t>
+              <w:t>Microsoft 0365 will automatically delete the data once academic year is complete and will take appropriate steps to remove the data once dissertation is complete.</w:t>
             </w:r>
           </w:p>
           <w:p>
@@ -3808,6 +3732,7 @@
                 <w:sz w:val="20"/>
                 <w:szCs w:val="20"/>
               </w:rPr>
+              <w:lastRenderedPageBreak/>
               <w:t xml:space="preserve">b) </w:t>
             </w:r>
             <w:sdt>
@@ -4632,6 +4557,39 @@
                 </w:rPr>
                 <w:id w:val="-658850332"/>
                 <w14:checkbox>
+                  <w14:checked w14:val="1"/>
+                  <w14:checkedState w14:val="2612" w14:font="MS Gothic"/>
+                  <w14:uncheckedState w14:val="2610" w14:font="MS Gothic"/>
+                </w14:checkbox>
+              </w:sdtPr>
+              <w:sdtContent>
+                <w:r>
+                  <w:rPr>
+                    <w:rFonts w:ascii="MS Gothic" w:eastAsia="MS Gothic" w:hAnsi="MS Gothic" w:cstheme="minorHAnsi" w:hint="eastAsia"/>
+                    <w:sz w:val="20"/>
+                    <w:szCs w:val="20"/>
+                  </w:rPr>
+                  <w:t>☒</w:t>
+                </w:r>
+              </w:sdtContent>
+            </w:sdt>
+            <w:r>
+              <w:rPr>
+                <w:rFonts w:ascii="Verdana" w:hAnsi="Verdana" w:cstheme="minorHAnsi"/>
+                <w:sz w:val="20"/>
+                <w:szCs w:val="20"/>
+              </w:rPr>
+              <w:t xml:space="preserve"> Yes </w:t>
+            </w:r>
+            <w:sdt>
+              <w:sdtPr>
+                <w:rPr>
+                  <w:rFonts w:ascii="Verdana" w:hAnsi="Verdana" w:cstheme="minorHAnsi"/>
+                  <w:sz w:val="20"/>
+                  <w:szCs w:val="20"/>
+                </w:rPr>
+                <w:id w:val="828260412"/>
+                <w14:checkbox>
                   <w14:checked w14:val="0"/>
                   <w14:checkedState w14:val="2612" w14:font="MS Gothic"/>
                   <w14:uncheckedState w14:val="2610" w14:font="MS Gothic"/>
@@ -4654,39 +4612,6 @@
                 <w:sz w:val="20"/>
                 <w:szCs w:val="20"/>
               </w:rPr>
-              <w:t xml:space="preserve"> Yes </w:t>
-            </w:r>
-            <w:sdt>
-              <w:sdtPr>
-                <w:rPr>
-                  <w:rFonts w:ascii="Verdana" w:hAnsi="Verdana" w:cstheme="minorHAnsi"/>
-                  <w:sz w:val="20"/>
-                  <w:szCs w:val="20"/>
-                </w:rPr>
-                <w:id w:val="828260412"/>
-                <w14:checkbox>
-                  <w14:checked w14:val="1"/>
-                  <w14:checkedState w14:val="2612" w14:font="MS Gothic"/>
-                  <w14:uncheckedState w14:val="2610" w14:font="MS Gothic"/>
-                </w14:checkbox>
-              </w:sdtPr>
-              <w:sdtContent>
-                <w:r>
-                  <w:rPr>
-                    <w:rFonts w:ascii="MS Gothic" w:eastAsia="MS Gothic" w:hAnsi="MS Gothic" w:cstheme="minorHAnsi" w:hint="eastAsia"/>
-                    <w:sz w:val="20"/>
-                    <w:szCs w:val="20"/>
-                  </w:rPr>
-                  <w:t>☒</w:t>
-                </w:r>
-              </w:sdtContent>
-            </w:sdt>
-            <w:r>
-              <w:rPr>
-                <w:rFonts w:ascii="Verdana" w:hAnsi="Verdana" w:cstheme="minorHAnsi"/>
-                <w:sz w:val="20"/>
-                <w:szCs w:val="20"/>
-              </w:rPr>
               <w:t xml:space="preserve"> No</w:t>
             </w:r>
           </w:p>
@@ -4770,6 +4695,14 @@
                 <w:szCs w:val="20"/>
               </w:rPr>
               <w:t>:</w:t>
+            </w:r>
+            <w:r>
+              <w:rPr>
+                <w:rFonts w:ascii="Verdana" w:hAnsi="Verdana" w:cstheme="minorHAnsi"/>
+                <w:sz w:val="20"/>
+                <w:szCs w:val="20"/>
+              </w:rPr>
+              <w:t>GitHub is private and only authorised users can access the repositry</w:t>
             </w:r>
           </w:p>
           <w:p>
@@ -5982,7 +5915,7 @@
                 </w:rPr>
                 <w:id w:val="1446501407"/>
                 <w14:checkbox>
-                  <w14:checked w14:val="1"/>
+                  <w14:checked w14:val="0"/>
                   <w14:checkedState w14:val="2612" w14:font="MS Gothic"/>
                   <w14:uncheckedState w14:val="2610" w14:font="MS Gothic"/>
                 </w14:checkbox>
@@ -5994,7 +5927,7 @@
                     <w:sz w:val="20"/>
                     <w:szCs w:val="20"/>
                   </w:rPr>
-                  <w:t>☒</w:t>
+                  <w:t>☐</w:t>
                 </w:r>
               </w:sdtContent>
             </w:sdt>
@@ -6733,6 +6666,34 @@
                 <w:szCs w:val="20"/>
               </w:rPr>
               <w:t>Date:</w:t>
+            </w:r>
+            <w:r>
+              <w:rPr>
+                <w:rFonts w:ascii="Verdana" w:hAnsi="Verdana" w:cstheme="minorHAnsi"/>
+                <w:b/>
+                <w:sz w:val="20"/>
+                <w:szCs w:val="20"/>
+              </w:rPr>
+              <w:t xml:space="preserve"> 16</w:t>
+            </w:r>
+            <w:r>
+              <w:rPr>
+                <w:rFonts w:ascii="Verdana" w:hAnsi="Verdana" w:cstheme="minorHAnsi"/>
+                <w:b/>
+                <w:sz w:val="20"/>
+                <w:szCs w:val="20"/>
+                <w:vertAlign w:val="superscript"/>
+              </w:rPr>
+              <w:t>th</w:t>
+            </w:r>
+            <w:r>
+              <w:rPr>
+                <w:rFonts w:ascii="Verdana" w:hAnsi="Verdana" w:cstheme="minorHAnsi"/>
+                <w:b/>
+                <w:sz w:val="20"/>
+                <w:szCs w:val="20"/>
+              </w:rPr>
+              <w:t xml:space="preserve"> October 2025</w:t>
             </w:r>
           </w:p>
           <w:p>
@@ -9960,7 +9921,12 @@
 </file>
 
 <file path=customXml/item1.xml><?xml version="1.0" encoding="utf-8"?>
-<b:Sources xmlns:b="http://schemas.openxmlformats.org/officeDocument/2006/bibliography" xmlns="http://schemas.openxmlformats.org/officeDocument/2006/bibliography" SelectedStyle="/APA.XSL" StyleName="APA"/>
+<?mso-contentType ?>
+<FormTemplates xmlns="http://schemas.microsoft.com/sharepoint/v3/contenttype/forms">
+  <Display>DocumentLibraryForm</Display>
+  <Edit>DocumentLibraryForm</Edit>
+  <New>DocumentLibraryForm</New>
+</FormTemplates>
 </file>
 
 <file path=customXml/item2.xml><?xml version="1.0" encoding="utf-8"?>
@@ -10135,12 +10101,7 @@
 </file>
 
 <file path=customXml/item3.xml><?xml version="1.0" encoding="utf-8"?>
-<?mso-contentType ?>
-<FormTemplates xmlns="http://schemas.microsoft.com/sharepoint/v3/contenttype/forms">
-  <Display>DocumentLibraryForm</Display>
-  <Edit>DocumentLibraryForm</Edit>
-  <New>DocumentLibraryForm</New>
-</FormTemplates>
+<b:Sources xmlns:b="http://schemas.openxmlformats.org/officeDocument/2006/bibliography" xmlns="http://schemas.openxmlformats.org/officeDocument/2006/bibliography" SelectedStyle="/APA.XSL" StyleName="APA"/>
 </file>
 
 <file path=customXml/item4.xml><?xml version="1.0" encoding="utf-8"?>
@@ -10150,9 +10111,9 @@
 </file>
 
 <file path=customXml/itemProps1.xml><?xml version="1.0" encoding="utf-8"?>
-<ds:datastoreItem xmlns:ds="http://schemas.openxmlformats.org/officeDocument/2006/customXml" ds:itemID="{91B843E6-7DD7-4A72-ABF7-084F66E6B92E}">
+<ds:datastoreItem xmlns:ds="http://schemas.openxmlformats.org/officeDocument/2006/customXml" ds:itemID="{3F2092D5-1824-46F1-97E7-49ADAC6E5FEC}">
   <ds:schemaRefs>
-    <ds:schemaRef ds:uri="http://schemas.openxmlformats.org/officeDocument/2006/bibliography"/>
+    <ds:schemaRef ds:uri="http://schemas.microsoft.com/sharepoint/v3/contenttype/forms"/>
   </ds:schemaRefs>
 </ds:datastoreItem>
 </file>
@@ -10177,9 +10138,9 @@
 </file>
 
 <file path=customXml/itemProps3.xml><?xml version="1.0" encoding="utf-8"?>
-<ds:datastoreItem xmlns:ds="http://schemas.openxmlformats.org/officeDocument/2006/customXml" ds:itemID="{3F2092D5-1824-46F1-97E7-49ADAC6E5FEC}">
+<ds:datastoreItem xmlns:ds="http://schemas.openxmlformats.org/officeDocument/2006/customXml" ds:itemID="{91B843E6-7DD7-4A72-ABF7-084F66E6B92E}">
   <ds:schemaRefs>
-    <ds:schemaRef ds:uri="http://schemas.microsoft.com/sharepoint/v3/contenttype/forms"/>
+    <ds:schemaRef ds:uri="http://schemas.openxmlformats.org/officeDocument/2006/bibliography"/>
   </ds:schemaRefs>
 </ds:datastoreItem>
 </file>

</xml_diff>

<commit_message>
Built FretboardCNN and fretboard evaluation
</commit_message>
<xml_diff>
--- a/docs/Data Management Plan (DMP) form.docx
+++ b/docs/Data Management Plan (DMP) form.docx
@@ -495,44 +495,64 @@
                 <w:sz w:val="20"/>
                 <w:szCs w:val="20"/>
               </w:rPr>
-              <w:t>Aryan Sunil TheStudent</w:t>
-            </w:r>
-          </w:p>
-          <w:p>
-            <w:pPr>
-              <w:rPr>
-                <w:rFonts w:ascii="Verdana" w:hAnsi="Verdana" w:cstheme="minorHAnsi"/>
-                <w:sz w:val="20"/>
-                <w:szCs w:val="20"/>
-              </w:rPr>
-            </w:pPr>
-          </w:p>
-          <w:p>
-            <w:pPr>
-              <w:rPr>
-                <w:rFonts w:ascii="Verdana" w:hAnsi="Verdana" w:cstheme="minorHAnsi"/>
-                <w:sz w:val="20"/>
-                <w:szCs w:val="20"/>
-              </w:rPr>
-            </w:pPr>
-          </w:p>
-          <w:p>
-            <w:pPr>
-              <w:rPr>
-                <w:rFonts w:ascii="Verdana" w:hAnsi="Verdana" w:cstheme="minorHAnsi"/>
-                <w:b/>
-                <w:sz w:val="20"/>
-                <w:szCs w:val="20"/>
-              </w:rPr>
-            </w:pPr>
-            <w:r>
-              <w:rPr>
-                <w:rFonts w:ascii="Verdana" w:hAnsi="Verdana" w:cstheme="minorHAnsi"/>
-                <w:sz w:val="20"/>
-                <w:szCs w:val="20"/>
-              </w:rPr>
-              <w:t>Juan Martinez Avila TheSupervisor</w:t>
-            </w:r>
+              <w:t xml:space="preserve">Aryan Sunil </w:t>
+            </w:r>
+            <w:proofErr w:type="spellStart"/>
+            <w:r>
+              <w:rPr>
+                <w:rFonts w:ascii="Verdana" w:hAnsi="Verdana" w:cstheme="minorHAnsi"/>
+                <w:sz w:val="20"/>
+                <w:szCs w:val="20"/>
+              </w:rPr>
+              <w:t>TheStudent</w:t>
+            </w:r>
+            <w:proofErr w:type="spellEnd"/>
+          </w:p>
+          <w:p>
+            <w:pPr>
+              <w:rPr>
+                <w:rFonts w:ascii="Verdana" w:hAnsi="Verdana" w:cstheme="minorHAnsi"/>
+                <w:sz w:val="20"/>
+                <w:szCs w:val="20"/>
+              </w:rPr>
+            </w:pPr>
+          </w:p>
+          <w:p>
+            <w:pPr>
+              <w:rPr>
+                <w:rFonts w:ascii="Verdana" w:hAnsi="Verdana" w:cstheme="minorHAnsi"/>
+                <w:sz w:val="20"/>
+                <w:szCs w:val="20"/>
+              </w:rPr>
+            </w:pPr>
+          </w:p>
+          <w:p>
+            <w:pPr>
+              <w:rPr>
+                <w:rFonts w:ascii="Verdana" w:hAnsi="Verdana" w:cstheme="minorHAnsi"/>
+                <w:b/>
+                <w:sz w:val="20"/>
+                <w:szCs w:val="20"/>
+              </w:rPr>
+            </w:pPr>
+            <w:r>
+              <w:rPr>
+                <w:rFonts w:ascii="Verdana" w:hAnsi="Verdana" w:cstheme="minorHAnsi"/>
+                <w:sz w:val="20"/>
+                <w:szCs w:val="20"/>
+              </w:rPr>
+              <w:t xml:space="preserve">Juan Martinez Avila </w:t>
+            </w:r>
+            <w:proofErr w:type="spellStart"/>
+            <w:r>
+              <w:rPr>
+                <w:rFonts w:ascii="Verdana" w:hAnsi="Verdana" w:cstheme="minorHAnsi"/>
+                <w:sz w:val="20"/>
+                <w:szCs w:val="20"/>
+              </w:rPr>
+              <w:t>TheSupervisor</w:t>
+            </w:r>
+            <w:proofErr w:type="spellEnd"/>
           </w:p>
         </w:tc>
       </w:tr>
@@ -670,7 +690,25 @@
                 <w:sz w:val="20"/>
                 <w:szCs w:val="20"/>
               </w:rPr>
-              <w:t xml:space="preserve"> TheStudent will collect, process, manage and analyse and report the data.</w:t>
+              <w:t xml:space="preserve"> </w:t>
+            </w:r>
+            <w:proofErr w:type="spellStart"/>
+            <w:r>
+              <w:rPr>
+                <w:rFonts w:ascii="Verdana" w:hAnsi="Verdana" w:cstheme="minorHAnsi"/>
+                <w:sz w:val="20"/>
+                <w:szCs w:val="20"/>
+              </w:rPr>
+              <w:t>TheStudent</w:t>
+            </w:r>
+            <w:proofErr w:type="spellEnd"/>
+            <w:r>
+              <w:rPr>
+                <w:rFonts w:ascii="Verdana" w:hAnsi="Verdana" w:cstheme="minorHAnsi"/>
+                <w:sz w:val="20"/>
+                <w:szCs w:val="20"/>
+              </w:rPr>
+              <w:t xml:space="preserve"> will collect, process, manage and analyse and report the data.</w:t>
             </w:r>
           </w:p>
         </w:tc>
@@ -780,7 +818,25 @@
                 <w:sz w:val="20"/>
                 <w:szCs w:val="20"/>
               </w:rPr>
-              <w:t>Juan TheSupervisor may review the data and reports.</w:t>
+              <w:t xml:space="preserve">Juan </w:t>
+            </w:r>
+            <w:proofErr w:type="spellStart"/>
+            <w:r>
+              <w:rPr>
+                <w:rFonts w:ascii="Verdana" w:hAnsi="Verdana" w:cstheme="minorHAnsi"/>
+                <w:sz w:val="20"/>
+                <w:szCs w:val="20"/>
+              </w:rPr>
+              <w:t>TheSupervisor</w:t>
+            </w:r>
+            <w:proofErr w:type="spellEnd"/>
+            <w:r>
+              <w:rPr>
+                <w:rFonts w:ascii="Verdana" w:hAnsi="Verdana" w:cstheme="minorHAnsi"/>
+                <w:sz w:val="20"/>
+                <w:szCs w:val="20"/>
+              </w:rPr>
+              <w:t xml:space="preserve"> may review the data and reports.</w:t>
             </w:r>
           </w:p>
           <w:p>
@@ -1031,7 +1087,27 @@
                 <w:sz w:val="20"/>
                 <w:szCs w:val="20"/>
               </w:rPr>
-              <w:t>No personal data will be used or obtained. Dataset such as GuitarSet will be used for benchmarking purposes</w:t>
+              <w:t xml:space="preserve">No personal data will be used or obtained. Dataset such as </w:t>
+            </w:r>
+            <w:proofErr w:type="spellStart"/>
+            <w:r>
+              <w:rPr>
+                <w:rFonts w:ascii="Verdana" w:hAnsi="Verdana" w:cstheme="minorHAnsi"/>
+                <w:bCs/>
+                <w:sz w:val="20"/>
+                <w:szCs w:val="20"/>
+              </w:rPr>
+              <w:t>GuitarSet</w:t>
+            </w:r>
+            <w:proofErr w:type="spellEnd"/>
+            <w:r>
+              <w:rPr>
+                <w:rFonts w:ascii="Verdana" w:hAnsi="Verdana" w:cstheme="minorHAnsi"/>
+                <w:bCs/>
+                <w:sz w:val="20"/>
+                <w:szCs w:val="20"/>
+              </w:rPr>
+              <w:t xml:space="preserve"> will be used for benchmarking purposes</w:t>
             </w:r>
             <w:r>
               <w:rPr>
@@ -1360,8 +1436,20 @@
                 <w:sz w:val="16"/>
                 <w:szCs w:val="16"/>
               </w:rPr>
-              <w:t>on University</w:t>
-            </w:r>
+              <w:t xml:space="preserve">on </w:t>
+            </w:r>
+            <w:proofErr w:type="gramStart"/>
+            <w:r>
+              <w:rPr>
+                <w:rFonts w:ascii="Verdana" w:hAnsi="Verdana" w:cstheme="minorHAnsi"/>
+                <w:i/>
+                <w:iCs/>
+                <w:sz w:val="16"/>
+                <w:szCs w:val="16"/>
+              </w:rPr>
+              <w:t>University</w:t>
+            </w:r>
+            <w:proofErr w:type="gramEnd"/>
             <w:r>
               <w:rPr>
                 <w:rFonts w:ascii="Verdana" w:hAnsi="Verdana" w:cstheme="minorHAnsi"/>
@@ -2141,39 +2229,6 @@
                   <w:szCs w:val="20"/>
                 </w:rPr>
                 <w:id w:val="-1578127811"/>
-                <w14:checkbox>
-                  <w14:checked w14:val="0"/>
-                  <w14:checkedState w14:val="2612" w14:font="MS Gothic"/>
-                  <w14:uncheckedState w14:val="2610" w14:font="MS Gothic"/>
-                </w14:checkbox>
-              </w:sdtPr>
-              <w:sdtContent>
-                <w:r>
-                  <w:rPr>
-                    <w:rFonts w:ascii="Segoe UI Symbol" w:eastAsia="MS Gothic" w:hAnsi="Segoe UI Symbol" w:cs="Segoe UI Symbol"/>
-                    <w:sz w:val="20"/>
-                    <w:szCs w:val="20"/>
-                  </w:rPr>
-                  <w:t>☐</w:t>
-                </w:r>
-              </w:sdtContent>
-            </w:sdt>
-            <w:r>
-              <w:rPr>
-                <w:rFonts w:ascii="Verdana" w:hAnsi="Verdana" w:cstheme="minorHAnsi"/>
-                <w:sz w:val="20"/>
-                <w:szCs w:val="20"/>
-              </w:rPr>
-              <w:t xml:space="preserve"> Yes </w:t>
-            </w:r>
-            <w:sdt>
-              <w:sdtPr>
-                <w:rPr>
-                  <w:rFonts w:ascii="Verdana" w:hAnsi="Verdana" w:cstheme="minorHAnsi"/>
-                  <w:sz w:val="20"/>
-                  <w:szCs w:val="20"/>
-                </w:rPr>
-                <w:id w:val="-1021308780"/>
                 <w14:checkbox>
                   <w14:checked w14:val="1"/>
                   <w14:checkedState w14:val="2612" w14:font="MS Gothic"/>
@@ -2197,294 +2252,8 @@
                 <w:sz w:val="20"/>
                 <w:szCs w:val="20"/>
               </w:rPr>
-              <w:t xml:space="preserve"> No</w:t>
-            </w:r>
-          </w:p>
-          <w:p>
-            <w:pPr>
-              <w:rPr>
-                <w:rFonts w:ascii="Verdana" w:hAnsi="Verdana" w:cstheme="minorHAnsi"/>
-                <w:sz w:val="20"/>
-                <w:szCs w:val="20"/>
-              </w:rPr>
-            </w:pPr>
-          </w:p>
-          <w:p>
-            <w:pPr>
-              <w:rPr>
-                <w:rFonts w:ascii="Verdana" w:hAnsi="Verdana" w:cstheme="minorHAnsi"/>
-                <w:sz w:val="20"/>
-                <w:szCs w:val="20"/>
-              </w:rPr>
-            </w:pPr>
-            <w:r>
-              <w:rPr>
-                <w:rFonts w:ascii="Verdana" w:hAnsi="Verdana" w:cstheme="minorHAnsi"/>
-                <w:sz w:val="20"/>
-                <w:szCs w:val="20"/>
-              </w:rPr>
-              <w:t>If Yes specify the categories of identifiable or potentially identifiable data</w:t>
-            </w:r>
-            <w:r>
-              <w:rPr>
-                <w:rFonts w:ascii="Verdana" w:hAnsi="Verdana" w:cstheme="minorHAnsi"/>
-                <w:sz w:val="20"/>
-                <w:szCs w:val="20"/>
-              </w:rPr>
-              <w:t xml:space="preserve"> that will be collected and used in the research</w:t>
-            </w:r>
-            <w:r>
-              <w:rPr>
-                <w:rFonts w:ascii="Verdana" w:hAnsi="Verdana" w:cstheme="minorHAnsi"/>
-                <w:sz w:val="20"/>
-                <w:szCs w:val="20"/>
-              </w:rPr>
-              <w:t>:</w:t>
-            </w:r>
-          </w:p>
-          <w:p>
-            <w:pPr>
-              <w:rPr>
-                <w:rFonts w:ascii="Verdana" w:hAnsi="Verdana" w:cstheme="minorHAnsi"/>
-                <w:i/>
-                <w:iCs/>
-                <w:sz w:val="16"/>
-                <w:szCs w:val="16"/>
-              </w:rPr>
-            </w:pPr>
-            <w:r>
-              <w:rPr>
-                <w:rFonts w:ascii="Verdana" w:hAnsi="Verdana" w:cstheme="minorHAnsi"/>
-                <w:i/>
-                <w:iCs/>
-                <w:sz w:val="16"/>
-                <w:szCs w:val="16"/>
-              </w:rPr>
-              <w:t xml:space="preserve">e.g., </w:t>
-            </w:r>
-            <w:r>
-              <w:rPr>
-                <w:rFonts w:ascii="Verdana" w:hAnsi="Verdana" w:cstheme="minorHAnsi"/>
-                <w:i/>
-                <w:iCs/>
-                <w:sz w:val="16"/>
-                <w:szCs w:val="16"/>
-              </w:rPr>
-              <w:t>names,</w:t>
-            </w:r>
-            <w:r>
-              <w:rPr>
-                <w:rFonts w:ascii="Verdana" w:hAnsi="Verdana" w:cstheme="minorHAnsi"/>
-                <w:i/>
-                <w:iCs/>
-                <w:sz w:val="16"/>
-                <w:szCs w:val="16"/>
-              </w:rPr>
-              <w:t xml:space="preserve"> postcodes, </w:t>
-            </w:r>
-            <w:r>
-              <w:rPr>
-                <w:rFonts w:ascii="Verdana" w:hAnsi="Verdana" w:cstheme="minorHAnsi"/>
-                <w:i/>
-                <w:iCs/>
-                <w:sz w:val="16"/>
-                <w:szCs w:val="16"/>
-              </w:rPr>
-              <w:t xml:space="preserve">audio data, </w:t>
-            </w:r>
-            <w:r>
-              <w:rPr>
-                <w:rFonts w:ascii="Verdana" w:hAnsi="Verdana" w:cstheme="minorHAnsi"/>
-                <w:i/>
-                <w:iCs/>
-                <w:sz w:val="16"/>
-                <w:szCs w:val="16"/>
-              </w:rPr>
-              <w:t xml:space="preserve">video data, IP or MAC addresses, </w:t>
-            </w:r>
-            <w:r>
-              <w:rPr>
-                <w:rFonts w:ascii="Verdana" w:hAnsi="Verdana" w:cstheme="minorHAnsi"/>
-                <w:i/>
-                <w:iCs/>
-                <w:sz w:val="16"/>
-                <w:szCs w:val="16"/>
-              </w:rPr>
-              <w:t>account handles</w:t>
-            </w:r>
-            <w:r>
-              <w:rPr>
-                <w:rFonts w:ascii="Verdana" w:hAnsi="Verdana" w:cstheme="minorHAnsi"/>
-                <w:i/>
-                <w:iCs/>
-                <w:sz w:val="16"/>
-                <w:szCs w:val="16"/>
-              </w:rPr>
-              <w:t>, etc.</w:t>
-            </w:r>
-          </w:p>
-          <w:p>
-            <w:pPr>
-              <w:rPr>
-                <w:rFonts w:ascii="Verdana" w:hAnsi="Verdana" w:cstheme="minorHAnsi"/>
-                <w:sz w:val="20"/>
-                <w:szCs w:val="20"/>
-              </w:rPr>
-            </w:pPr>
-          </w:p>
-          <w:p>
-            <w:pPr>
-              <w:rPr>
-                <w:rFonts w:ascii="Verdana" w:hAnsi="Verdana" w:cstheme="minorHAnsi"/>
-                <w:sz w:val="20"/>
-                <w:szCs w:val="20"/>
-              </w:rPr>
-            </w:pPr>
-          </w:p>
-          <w:p>
-            <w:pPr>
-              <w:rPr>
-                <w:rFonts w:ascii="Verdana" w:hAnsi="Verdana" w:cstheme="minorHAnsi"/>
-                <w:sz w:val="20"/>
-                <w:szCs w:val="20"/>
-              </w:rPr>
-            </w:pPr>
-            <w:r>
-              <w:rPr>
-                <w:rFonts w:ascii="Verdana" w:hAnsi="Verdana" w:cstheme="minorHAnsi"/>
-                <w:b/>
-                <w:bCs/>
-                <w:sz w:val="20"/>
-                <w:szCs w:val="20"/>
-              </w:rPr>
-              <w:t>5.2</w:t>
-            </w:r>
-            <w:r>
-              <w:rPr>
-                <w:rFonts w:ascii="Verdana" w:hAnsi="Verdana" w:cstheme="minorHAnsi"/>
-                <w:sz w:val="20"/>
-                <w:szCs w:val="20"/>
-              </w:rPr>
-              <w:t xml:space="preserve"> </w:t>
-            </w:r>
-            <w:r>
-              <w:rPr>
-                <w:rFonts w:ascii="Verdana" w:hAnsi="Verdana" w:cstheme="minorHAnsi"/>
-                <w:b/>
-                <w:bCs/>
-                <w:sz w:val="20"/>
-                <w:szCs w:val="20"/>
-              </w:rPr>
-              <w:t xml:space="preserve">Will </w:t>
-            </w:r>
-            <w:r>
-              <w:rPr>
-                <w:rFonts w:ascii="Verdana" w:hAnsi="Verdana" w:cstheme="minorHAnsi"/>
-                <w:b/>
-                <w:bCs/>
-                <w:sz w:val="20"/>
-                <w:szCs w:val="20"/>
-              </w:rPr>
-              <w:t xml:space="preserve">data that </w:t>
-            </w:r>
-            <w:r>
-              <w:rPr>
-                <w:rFonts w:ascii="Verdana" w:hAnsi="Verdana" w:cstheme="minorHAnsi"/>
-                <w:b/>
-                <w:bCs/>
-                <w:sz w:val="20"/>
-                <w:szCs w:val="20"/>
-              </w:rPr>
-              <w:t>identif</w:t>
-            </w:r>
-            <w:r>
-              <w:rPr>
-                <w:rFonts w:ascii="Verdana" w:hAnsi="Verdana" w:cstheme="minorHAnsi"/>
-                <w:b/>
-                <w:bCs/>
-                <w:sz w:val="20"/>
-                <w:szCs w:val="20"/>
-              </w:rPr>
-              <w:t>ies or could</w:t>
-            </w:r>
-            <w:r>
-              <w:rPr>
-                <w:rFonts w:ascii="Verdana" w:hAnsi="Verdana" w:cstheme="minorHAnsi"/>
-                <w:b/>
-                <w:bCs/>
-                <w:sz w:val="20"/>
-                <w:szCs w:val="20"/>
-              </w:rPr>
-              <w:t xml:space="preserve"> identif</w:t>
-            </w:r>
-            <w:r>
-              <w:rPr>
-                <w:rFonts w:ascii="Verdana" w:hAnsi="Verdana" w:cstheme="minorHAnsi"/>
-                <w:b/>
-                <w:bCs/>
-                <w:sz w:val="20"/>
-                <w:szCs w:val="20"/>
-              </w:rPr>
-              <w:t xml:space="preserve">y people </w:t>
-            </w:r>
-            <w:r>
-              <w:rPr>
-                <w:rFonts w:ascii="Verdana" w:hAnsi="Verdana" w:cstheme="minorHAnsi"/>
-                <w:b/>
-                <w:bCs/>
-                <w:sz w:val="20"/>
-                <w:szCs w:val="20"/>
-              </w:rPr>
-              <w:t xml:space="preserve">be </w:t>
-            </w:r>
-            <w:r>
-              <w:rPr>
-                <w:rFonts w:ascii="Verdana" w:hAnsi="Verdana" w:cstheme="minorHAnsi"/>
-                <w:b/>
-                <w:bCs/>
-                <w:sz w:val="20"/>
-                <w:szCs w:val="20"/>
-              </w:rPr>
-              <w:t>de-identified (anonymised or pseudonymised)</w:t>
-            </w:r>
-            <w:r>
-              <w:rPr>
-                <w:rFonts w:ascii="Verdana" w:hAnsi="Verdana" w:cstheme="minorHAnsi"/>
-                <w:b/>
-                <w:bCs/>
-                <w:sz w:val="20"/>
-                <w:szCs w:val="20"/>
-              </w:rPr>
-              <w:t xml:space="preserve"> before it is used</w:t>
-            </w:r>
-            <w:r>
-              <w:rPr>
-                <w:rFonts w:ascii="Verdana" w:hAnsi="Verdana" w:cstheme="minorHAnsi"/>
-                <w:b/>
-                <w:bCs/>
-                <w:sz w:val="20"/>
-                <w:szCs w:val="20"/>
-              </w:rPr>
-              <w:t>?</w:t>
-            </w:r>
-          </w:p>
-          <w:p>
-            <w:pPr>
-              <w:rPr>
-                <w:rFonts w:ascii="Verdana" w:hAnsi="Verdana" w:cstheme="minorHAnsi"/>
-                <w:sz w:val="20"/>
-                <w:szCs w:val="20"/>
-              </w:rPr>
-            </w:pPr>
-          </w:p>
-          <w:p>
-            <w:pPr>
-              <w:rPr>
-                <w:rFonts w:ascii="Verdana" w:hAnsi="Verdana" w:cstheme="minorHAnsi"/>
-                <w:sz w:val="20"/>
-                <w:szCs w:val="20"/>
-              </w:rPr>
-            </w:pPr>
+              <w:t xml:space="preserve"> Yes </w:t>
+            </w:r>
             <w:sdt>
               <w:sdtPr>
                 <w:rPr>
@@ -2492,7 +2261,7 @@
                   <w:sz w:val="20"/>
                   <w:szCs w:val="20"/>
                 </w:rPr>
-                <w:id w:val="-1254664471"/>
+                <w:id w:val="-1021308780"/>
                 <w14:checkbox>
                   <w14:checked w14:val="0"/>
                   <w14:checkedState w14:val="2612" w14:font="MS Gothic"/>
@@ -2507,6 +2276,343 @@
                     <w:szCs w:val="20"/>
                   </w:rPr>
                   <w:t>☐</w:t>
+                </w:r>
+              </w:sdtContent>
+            </w:sdt>
+            <w:r>
+              <w:rPr>
+                <w:rFonts w:ascii="Verdana" w:hAnsi="Verdana" w:cstheme="minorHAnsi"/>
+                <w:sz w:val="20"/>
+                <w:szCs w:val="20"/>
+              </w:rPr>
+              <w:t xml:space="preserve"> No</w:t>
+            </w:r>
+          </w:p>
+          <w:p>
+            <w:pPr>
+              <w:rPr>
+                <w:rFonts w:ascii="Verdana" w:hAnsi="Verdana" w:cstheme="minorHAnsi"/>
+                <w:sz w:val="20"/>
+                <w:szCs w:val="20"/>
+              </w:rPr>
+            </w:pPr>
+          </w:p>
+          <w:p>
+            <w:pPr>
+              <w:rPr>
+                <w:rFonts w:ascii="Verdana" w:hAnsi="Verdana" w:cstheme="minorHAnsi"/>
+                <w:sz w:val="20"/>
+                <w:szCs w:val="20"/>
+              </w:rPr>
+            </w:pPr>
+            <w:r>
+              <w:rPr>
+                <w:rFonts w:ascii="Verdana" w:hAnsi="Verdana" w:cstheme="minorHAnsi"/>
+                <w:sz w:val="20"/>
+                <w:szCs w:val="20"/>
+              </w:rPr>
+              <w:t xml:space="preserve">If </w:t>
+            </w:r>
+            <w:proofErr w:type="gramStart"/>
+            <w:r>
+              <w:rPr>
+                <w:rFonts w:ascii="Verdana" w:hAnsi="Verdana" w:cstheme="minorHAnsi"/>
+                <w:sz w:val="20"/>
+                <w:szCs w:val="20"/>
+              </w:rPr>
+              <w:t>Yes</w:t>
+            </w:r>
+            <w:proofErr w:type="gramEnd"/>
+            <w:r>
+              <w:rPr>
+                <w:rFonts w:ascii="Verdana" w:hAnsi="Verdana" w:cstheme="minorHAnsi"/>
+                <w:sz w:val="20"/>
+                <w:szCs w:val="20"/>
+              </w:rPr>
+              <w:t xml:space="preserve"> specify the categories of identifiable or potentially identifiable data</w:t>
+            </w:r>
+            <w:r>
+              <w:rPr>
+                <w:rFonts w:ascii="Verdana" w:hAnsi="Verdana" w:cstheme="minorHAnsi"/>
+                <w:sz w:val="20"/>
+                <w:szCs w:val="20"/>
+              </w:rPr>
+              <w:t xml:space="preserve"> that will be collected and used in the research</w:t>
+            </w:r>
+            <w:r>
+              <w:rPr>
+                <w:rFonts w:ascii="Verdana" w:hAnsi="Verdana" w:cstheme="minorHAnsi"/>
+                <w:sz w:val="20"/>
+                <w:szCs w:val="20"/>
+              </w:rPr>
+              <w:t>:</w:t>
+            </w:r>
+          </w:p>
+          <w:p>
+            <w:pPr>
+              <w:rPr>
+                <w:rFonts w:ascii="Verdana" w:hAnsi="Verdana" w:cstheme="minorHAnsi"/>
+                <w:i/>
+                <w:iCs/>
+                <w:sz w:val="16"/>
+                <w:szCs w:val="16"/>
+              </w:rPr>
+            </w:pPr>
+            <w:r>
+              <w:rPr>
+                <w:rFonts w:ascii="Verdana" w:hAnsi="Verdana" w:cstheme="minorHAnsi"/>
+                <w:i/>
+                <w:iCs/>
+                <w:sz w:val="16"/>
+                <w:szCs w:val="16"/>
+              </w:rPr>
+              <w:t xml:space="preserve">e.g., </w:t>
+            </w:r>
+            <w:r>
+              <w:rPr>
+                <w:rFonts w:ascii="Verdana" w:hAnsi="Verdana" w:cstheme="minorHAnsi"/>
+                <w:i/>
+                <w:iCs/>
+                <w:sz w:val="16"/>
+                <w:szCs w:val="16"/>
+              </w:rPr>
+              <w:t>names,</w:t>
+            </w:r>
+            <w:r>
+              <w:rPr>
+                <w:rFonts w:ascii="Verdana" w:hAnsi="Verdana" w:cstheme="minorHAnsi"/>
+                <w:i/>
+                <w:iCs/>
+                <w:sz w:val="16"/>
+                <w:szCs w:val="16"/>
+              </w:rPr>
+              <w:t xml:space="preserve"> postcodes, </w:t>
+            </w:r>
+            <w:r>
+              <w:rPr>
+                <w:rFonts w:ascii="Verdana" w:hAnsi="Verdana" w:cstheme="minorHAnsi"/>
+                <w:i/>
+                <w:iCs/>
+                <w:sz w:val="16"/>
+                <w:szCs w:val="16"/>
+              </w:rPr>
+              <w:t xml:space="preserve">audio data, </w:t>
+            </w:r>
+            <w:r>
+              <w:rPr>
+                <w:rFonts w:ascii="Verdana" w:hAnsi="Verdana" w:cstheme="minorHAnsi"/>
+                <w:i/>
+                <w:iCs/>
+                <w:sz w:val="16"/>
+                <w:szCs w:val="16"/>
+              </w:rPr>
+              <w:t xml:space="preserve">video data, IP or MAC addresses, </w:t>
+            </w:r>
+            <w:r>
+              <w:rPr>
+                <w:rFonts w:ascii="Verdana" w:hAnsi="Verdana" w:cstheme="minorHAnsi"/>
+                <w:i/>
+                <w:iCs/>
+                <w:sz w:val="16"/>
+                <w:szCs w:val="16"/>
+              </w:rPr>
+              <w:t>account handles</w:t>
+            </w:r>
+            <w:r>
+              <w:rPr>
+                <w:rFonts w:ascii="Verdana" w:hAnsi="Verdana" w:cstheme="minorHAnsi"/>
+                <w:i/>
+                <w:iCs/>
+                <w:sz w:val="16"/>
+                <w:szCs w:val="16"/>
+              </w:rPr>
+              <w:t>, etc.</w:t>
+            </w:r>
+          </w:p>
+          <w:p>
+            <w:pPr>
+              <w:rPr>
+                <w:rFonts w:ascii="Verdana" w:hAnsi="Verdana" w:cstheme="minorHAnsi"/>
+                <w:sz w:val="20"/>
+                <w:szCs w:val="20"/>
+              </w:rPr>
+            </w:pPr>
+          </w:p>
+          <w:p>
+            <w:pPr>
+              <w:rPr>
+                <w:rFonts w:ascii="Verdana" w:hAnsi="Verdana" w:cstheme="minorHAnsi"/>
+                <w:sz w:val="20"/>
+                <w:szCs w:val="20"/>
+              </w:rPr>
+            </w:pPr>
+          </w:p>
+          <w:p>
+            <w:pPr>
+              <w:rPr>
+                <w:rFonts w:ascii="Verdana" w:hAnsi="Verdana" w:cstheme="minorHAnsi"/>
+                <w:sz w:val="20"/>
+                <w:szCs w:val="20"/>
+              </w:rPr>
+            </w:pPr>
+            <w:r>
+              <w:rPr>
+                <w:rFonts w:ascii="Verdana" w:hAnsi="Verdana" w:cstheme="minorHAnsi"/>
+                <w:b/>
+                <w:bCs/>
+                <w:sz w:val="20"/>
+                <w:szCs w:val="20"/>
+              </w:rPr>
+              <w:t>5.2</w:t>
+            </w:r>
+            <w:r>
+              <w:rPr>
+                <w:rFonts w:ascii="Verdana" w:hAnsi="Verdana" w:cstheme="minorHAnsi"/>
+                <w:sz w:val="20"/>
+                <w:szCs w:val="20"/>
+              </w:rPr>
+              <w:t xml:space="preserve"> </w:t>
+            </w:r>
+            <w:r>
+              <w:rPr>
+                <w:rFonts w:ascii="Verdana" w:hAnsi="Verdana" w:cstheme="minorHAnsi"/>
+                <w:b/>
+                <w:bCs/>
+                <w:sz w:val="20"/>
+                <w:szCs w:val="20"/>
+              </w:rPr>
+              <w:t xml:space="preserve">Will </w:t>
+            </w:r>
+            <w:r>
+              <w:rPr>
+                <w:rFonts w:ascii="Verdana" w:hAnsi="Verdana" w:cstheme="minorHAnsi"/>
+                <w:b/>
+                <w:bCs/>
+                <w:sz w:val="20"/>
+                <w:szCs w:val="20"/>
+              </w:rPr>
+              <w:t xml:space="preserve">data that </w:t>
+            </w:r>
+            <w:r>
+              <w:rPr>
+                <w:rFonts w:ascii="Verdana" w:hAnsi="Verdana" w:cstheme="minorHAnsi"/>
+                <w:b/>
+                <w:bCs/>
+                <w:sz w:val="20"/>
+                <w:szCs w:val="20"/>
+              </w:rPr>
+              <w:t>identif</w:t>
+            </w:r>
+            <w:r>
+              <w:rPr>
+                <w:rFonts w:ascii="Verdana" w:hAnsi="Verdana" w:cstheme="minorHAnsi"/>
+                <w:b/>
+                <w:bCs/>
+                <w:sz w:val="20"/>
+                <w:szCs w:val="20"/>
+              </w:rPr>
+              <w:t>ies or could</w:t>
+            </w:r>
+            <w:r>
+              <w:rPr>
+                <w:rFonts w:ascii="Verdana" w:hAnsi="Verdana" w:cstheme="minorHAnsi"/>
+                <w:b/>
+                <w:bCs/>
+                <w:sz w:val="20"/>
+                <w:szCs w:val="20"/>
+              </w:rPr>
+              <w:t xml:space="preserve"> identif</w:t>
+            </w:r>
+            <w:r>
+              <w:rPr>
+                <w:rFonts w:ascii="Verdana" w:hAnsi="Verdana" w:cstheme="minorHAnsi"/>
+                <w:b/>
+                <w:bCs/>
+                <w:sz w:val="20"/>
+                <w:szCs w:val="20"/>
+              </w:rPr>
+              <w:t xml:space="preserve">y people </w:t>
+            </w:r>
+            <w:r>
+              <w:rPr>
+                <w:rFonts w:ascii="Verdana" w:hAnsi="Verdana" w:cstheme="minorHAnsi"/>
+                <w:b/>
+                <w:bCs/>
+                <w:sz w:val="20"/>
+                <w:szCs w:val="20"/>
+              </w:rPr>
+              <w:t xml:space="preserve">be </w:t>
+            </w:r>
+            <w:r>
+              <w:rPr>
+                <w:rFonts w:ascii="Verdana" w:hAnsi="Verdana" w:cstheme="minorHAnsi"/>
+                <w:b/>
+                <w:bCs/>
+                <w:sz w:val="20"/>
+                <w:szCs w:val="20"/>
+              </w:rPr>
+              <w:t>de-identified (anonymised or pseudonymised)</w:t>
+            </w:r>
+            <w:r>
+              <w:rPr>
+                <w:rFonts w:ascii="Verdana" w:hAnsi="Verdana" w:cstheme="minorHAnsi"/>
+                <w:b/>
+                <w:bCs/>
+                <w:sz w:val="20"/>
+                <w:szCs w:val="20"/>
+              </w:rPr>
+              <w:t xml:space="preserve"> before it is used</w:t>
+            </w:r>
+            <w:r>
+              <w:rPr>
+                <w:rFonts w:ascii="Verdana" w:hAnsi="Verdana" w:cstheme="minorHAnsi"/>
+                <w:b/>
+                <w:bCs/>
+                <w:sz w:val="20"/>
+                <w:szCs w:val="20"/>
+              </w:rPr>
+              <w:t>?</w:t>
+            </w:r>
+          </w:p>
+          <w:p>
+            <w:pPr>
+              <w:rPr>
+                <w:rFonts w:ascii="Verdana" w:hAnsi="Verdana" w:cstheme="minorHAnsi"/>
+                <w:sz w:val="20"/>
+                <w:szCs w:val="20"/>
+              </w:rPr>
+            </w:pPr>
+          </w:p>
+          <w:p>
+            <w:pPr>
+              <w:rPr>
+                <w:rFonts w:ascii="Verdana" w:hAnsi="Verdana" w:cstheme="minorHAnsi"/>
+                <w:sz w:val="20"/>
+                <w:szCs w:val="20"/>
+              </w:rPr>
+            </w:pPr>
+            <w:sdt>
+              <w:sdtPr>
+                <w:rPr>
+                  <w:rFonts w:ascii="Verdana" w:hAnsi="Verdana" w:cstheme="minorHAnsi"/>
+                  <w:sz w:val="20"/>
+                  <w:szCs w:val="20"/>
+                </w:rPr>
+                <w:id w:val="-1254664471"/>
+                <w14:checkbox>
+                  <w14:checked w14:val="1"/>
+                  <w14:checkedState w14:val="2612" w14:font="MS Gothic"/>
+                  <w14:uncheckedState w14:val="2610" w14:font="MS Gothic"/>
+                </w14:checkbox>
+              </w:sdtPr>
+              <w:sdtContent>
+                <w:r>
+                  <w:rPr>
+                    <w:rFonts w:ascii="MS Gothic" w:eastAsia="MS Gothic" w:hAnsi="MS Gothic" w:cstheme="minorHAnsi" w:hint="eastAsia"/>
+                    <w:sz w:val="20"/>
+                    <w:szCs w:val="20"/>
+                  </w:rPr>
+                  <w:t>☒</w:t>
                 </w:r>
               </w:sdtContent>
             </w:sdt>
@@ -2568,6 +2674,234 @@
                 </w:rPr>
                 <w:id w:val="1816449058"/>
                 <w14:checkbox>
+                  <w14:checked w14:val="0"/>
+                  <w14:checkedState w14:val="2612" w14:font="MS Gothic"/>
+                  <w14:uncheckedState w14:val="2610" w14:font="MS Gothic"/>
+                </w14:checkbox>
+              </w:sdtPr>
+              <w:sdtContent>
+                <w:r>
+                  <w:rPr>
+                    <w:rFonts w:ascii="MS Gothic" w:eastAsia="MS Gothic" w:hAnsi="MS Gothic" w:cstheme="minorHAnsi" w:hint="eastAsia"/>
+                    <w:sz w:val="20"/>
+                    <w:szCs w:val="20"/>
+                  </w:rPr>
+                  <w:t>☐</w:t>
+                </w:r>
+              </w:sdtContent>
+            </w:sdt>
+            <w:r>
+              <w:rPr>
+                <w:rFonts w:ascii="Verdana" w:hAnsi="Verdana" w:cstheme="minorHAnsi"/>
+                <w:sz w:val="20"/>
+                <w:szCs w:val="20"/>
+              </w:rPr>
+              <w:t xml:space="preserve"> N</w:t>
+            </w:r>
+            <w:r>
+              <w:rPr>
+                <w:rFonts w:ascii="Verdana" w:hAnsi="Verdana" w:cstheme="minorHAnsi"/>
+                <w:sz w:val="20"/>
+                <w:szCs w:val="20"/>
+              </w:rPr>
+              <w:t>/A</w:t>
+            </w:r>
+          </w:p>
+          <w:p>
+            <w:pPr>
+              <w:rPr>
+                <w:rFonts w:ascii="Verdana" w:hAnsi="Verdana" w:cstheme="minorHAnsi"/>
+                <w:sz w:val="20"/>
+                <w:szCs w:val="20"/>
+              </w:rPr>
+            </w:pPr>
+          </w:p>
+          <w:p>
+            <w:pPr>
+              <w:rPr>
+                <w:rFonts w:ascii="Verdana" w:hAnsi="Verdana" w:cstheme="minorHAnsi"/>
+                <w:b/>
+                <w:bCs/>
+                <w:sz w:val="20"/>
+                <w:szCs w:val="20"/>
+              </w:rPr>
+            </w:pPr>
+            <w:r>
+              <w:rPr>
+                <w:rFonts w:ascii="Verdana" w:hAnsi="Verdana" w:cstheme="minorHAnsi"/>
+                <w:b/>
+                <w:bCs/>
+                <w:sz w:val="20"/>
+                <w:szCs w:val="20"/>
+              </w:rPr>
+              <w:t>5</w:t>
+            </w:r>
+            <w:r>
+              <w:rPr>
+                <w:rFonts w:ascii="Verdana" w:hAnsi="Verdana" w:cstheme="minorHAnsi"/>
+                <w:b/>
+                <w:bCs/>
+                <w:sz w:val="20"/>
+                <w:szCs w:val="20"/>
+              </w:rPr>
+              <w:t>.</w:t>
+            </w:r>
+            <w:r>
+              <w:rPr>
+                <w:rFonts w:ascii="Verdana" w:hAnsi="Verdana" w:cstheme="minorHAnsi"/>
+                <w:b/>
+                <w:bCs/>
+                <w:sz w:val="20"/>
+                <w:szCs w:val="20"/>
+              </w:rPr>
+              <w:t>3</w:t>
+            </w:r>
+            <w:r>
+              <w:rPr>
+                <w:rFonts w:ascii="Verdana" w:hAnsi="Verdana" w:cstheme="minorHAnsi"/>
+                <w:sz w:val="20"/>
+                <w:szCs w:val="20"/>
+              </w:rPr>
+              <w:t xml:space="preserve"> </w:t>
+            </w:r>
+            <w:r>
+              <w:rPr>
+                <w:rFonts w:ascii="Verdana" w:hAnsi="Verdana" w:cstheme="minorHAnsi"/>
+                <w:b/>
+                <w:bCs/>
+                <w:sz w:val="20"/>
+                <w:szCs w:val="20"/>
+              </w:rPr>
+              <w:t xml:space="preserve">Will </w:t>
+            </w:r>
+            <w:r>
+              <w:rPr>
+                <w:rFonts w:ascii="Verdana" w:hAnsi="Verdana" w:cstheme="minorHAnsi"/>
+                <w:b/>
+                <w:bCs/>
+                <w:sz w:val="20"/>
+                <w:szCs w:val="20"/>
+              </w:rPr>
+              <w:t xml:space="preserve">data that </w:t>
+            </w:r>
+            <w:r>
+              <w:rPr>
+                <w:rFonts w:ascii="Verdana" w:hAnsi="Verdana" w:cstheme="minorHAnsi"/>
+                <w:b/>
+                <w:bCs/>
+                <w:sz w:val="20"/>
+                <w:szCs w:val="20"/>
+              </w:rPr>
+              <w:t>identif</w:t>
+            </w:r>
+            <w:r>
+              <w:rPr>
+                <w:rFonts w:ascii="Verdana" w:hAnsi="Verdana" w:cstheme="minorHAnsi"/>
+                <w:b/>
+                <w:bCs/>
+                <w:sz w:val="20"/>
+                <w:szCs w:val="20"/>
+              </w:rPr>
+              <w:t>ies or could</w:t>
+            </w:r>
+            <w:r>
+              <w:rPr>
+                <w:rFonts w:ascii="Verdana" w:hAnsi="Verdana" w:cstheme="minorHAnsi"/>
+                <w:b/>
+                <w:bCs/>
+                <w:sz w:val="20"/>
+                <w:szCs w:val="20"/>
+              </w:rPr>
+              <w:t xml:space="preserve"> identif</w:t>
+            </w:r>
+            <w:r>
+              <w:rPr>
+                <w:rFonts w:ascii="Verdana" w:hAnsi="Verdana" w:cstheme="minorHAnsi"/>
+                <w:b/>
+                <w:bCs/>
+                <w:sz w:val="20"/>
+                <w:szCs w:val="20"/>
+              </w:rPr>
+              <w:t xml:space="preserve">y people </w:t>
+            </w:r>
+            <w:r>
+              <w:rPr>
+                <w:rFonts w:ascii="Verdana" w:hAnsi="Verdana" w:cstheme="minorHAnsi"/>
+                <w:b/>
+                <w:bCs/>
+                <w:sz w:val="20"/>
+                <w:szCs w:val="20"/>
+              </w:rPr>
+              <w:t xml:space="preserve">be destroyed </w:t>
+            </w:r>
+            <w:r>
+              <w:rPr>
+                <w:rFonts w:ascii="Verdana" w:hAnsi="Verdana" w:cstheme="minorHAnsi"/>
+                <w:b/>
+                <w:bCs/>
+                <w:sz w:val="20"/>
+                <w:szCs w:val="20"/>
+              </w:rPr>
+              <w:t>after it has been de-identified</w:t>
+            </w:r>
+            <w:r>
+              <w:rPr>
+                <w:rFonts w:ascii="Verdana" w:hAnsi="Verdana" w:cstheme="minorHAnsi"/>
+                <w:b/>
+                <w:bCs/>
+                <w:sz w:val="20"/>
+                <w:szCs w:val="20"/>
+              </w:rPr>
+              <w:t>?</w:t>
+            </w:r>
+          </w:p>
+          <w:p>
+            <w:pPr>
+              <w:rPr>
+                <w:rFonts w:ascii="Verdana" w:hAnsi="Verdana" w:cstheme="minorHAnsi"/>
+                <w:i/>
+                <w:iCs/>
+                <w:sz w:val="16"/>
+                <w:szCs w:val="16"/>
+              </w:rPr>
+            </w:pPr>
+            <w:r>
+              <w:rPr>
+                <w:rFonts w:ascii="Verdana" w:hAnsi="Verdana" w:cstheme="minorHAnsi"/>
+                <w:i/>
+                <w:iCs/>
+                <w:sz w:val="16"/>
+                <w:szCs w:val="16"/>
+              </w:rPr>
+              <w:t>e.g., will audio recordings be destroyed after they have been transcribed or textual responses had identifying details removed</w:t>
+            </w:r>
+          </w:p>
+          <w:p>
+            <w:pPr>
+              <w:rPr>
+                <w:rFonts w:ascii="Verdana" w:hAnsi="Verdana" w:cstheme="minorHAnsi"/>
+                <w:sz w:val="20"/>
+                <w:szCs w:val="20"/>
+              </w:rPr>
+            </w:pPr>
+          </w:p>
+          <w:p>
+            <w:pPr>
+              <w:rPr>
+                <w:rFonts w:ascii="Verdana" w:hAnsi="Verdana" w:cstheme="minorHAnsi"/>
+                <w:sz w:val="20"/>
+                <w:szCs w:val="20"/>
+              </w:rPr>
+            </w:pPr>
+            <w:sdt>
+              <w:sdtPr>
+                <w:rPr>
+                  <w:rFonts w:ascii="Verdana" w:hAnsi="Verdana" w:cstheme="minorHAnsi"/>
+                  <w:sz w:val="20"/>
+                  <w:szCs w:val="20"/>
+                </w:rPr>
+                <w:id w:val="-1073435287"/>
+                <w14:checkbox>
                   <w14:checked w14:val="1"/>
                   <w14:checkedState w14:val="2612" w14:font="MS Gothic"/>
                   <w14:uncheckedState w14:val="2610" w14:font="MS Gothic"/>
@@ -2581,234 +2915,6 @@
                     <w:szCs w:val="20"/>
                   </w:rPr>
                   <w:t>☒</w:t>
-                </w:r>
-              </w:sdtContent>
-            </w:sdt>
-            <w:r>
-              <w:rPr>
-                <w:rFonts w:ascii="Verdana" w:hAnsi="Verdana" w:cstheme="minorHAnsi"/>
-                <w:sz w:val="20"/>
-                <w:szCs w:val="20"/>
-              </w:rPr>
-              <w:t xml:space="preserve"> N</w:t>
-            </w:r>
-            <w:r>
-              <w:rPr>
-                <w:rFonts w:ascii="Verdana" w:hAnsi="Verdana" w:cstheme="minorHAnsi"/>
-                <w:sz w:val="20"/>
-                <w:szCs w:val="20"/>
-              </w:rPr>
-              <w:t>/A</w:t>
-            </w:r>
-          </w:p>
-          <w:p>
-            <w:pPr>
-              <w:rPr>
-                <w:rFonts w:ascii="Verdana" w:hAnsi="Verdana" w:cstheme="minorHAnsi"/>
-                <w:sz w:val="20"/>
-                <w:szCs w:val="20"/>
-              </w:rPr>
-            </w:pPr>
-          </w:p>
-          <w:p>
-            <w:pPr>
-              <w:rPr>
-                <w:rFonts w:ascii="Verdana" w:hAnsi="Verdana" w:cstheme="minorHAnsi"/>
-                <w:b/>
-                <w:bCs/>
-                <w:sz w:val="20"/>
-                <w:szCs w:val="20"/>
-              </w:rPr>
-            </w:pPr>
-            <w:r>
-              <w:rPr>
-                <w:rFonts w:ascii="Verdana" w:hAnsi="Verdana" w:cstheme="minorHAnsi"/>
-                <w:b/>
-                <w:bCs/>
-                <w:sz w:val="20"/>
-                <w:szCs w:val="20"/>
-              </w:rPr>
-              <w:t>5</w:t>
-            </w:r>
-            <w:r>
-              <w:rPr>
-                <w:rFonts w:ascii="Verdana" w:hAnsi="Verdana" w:cstheme="minorHAnsi"/>
-                <w:b/>
-                <w:bCs/>
-                <w:sz w:val="20"/>
-                <w:szCs w:val="20"/>
-              </w:rPr>
-              <w:t>.</w:t>
-            </w:r>
-            <w:r>
-              <w:rPr>
-                <w:rFonts w:ascii="Verdana" w:hAnsi="Verdana" w:cstheme="minorHAnsi"/>
-                <w:b/>
-                <w:bCs/>
-                <w:sz w:val="20"/>
-                <w:szCs w:val="20"/>
-              </w:rPr>
-              <w:t>3</w:t>
-            </w:r>
-            <w:r>
-              <w:rPr>
-                <w:rFonts w:ascii="Verdana" w:hAnsi="Verdana" w:cstheme="minorHAnsi"/>
-                <w:sz w:val="20"/>
-                <w:szCs w:val="20"/>
-              </w:rPr>
-              <w:t xml:space="preserve"> </w:t>
-            </w:r>
-            <w:r>
-              <w:rPr>
-                <w:rFonts w:ascii="Verdana" w:hAnsi="Verdana" w:cstheme="minorHAnsi"/>
-                <w:b/>
-                <w:bCs/>
-                <w:sz w:val="20"/>
-                <w:szCs w:val="20"/>
-              </w:rPr>
-              <w:t xml:space="preserve">Will </w:t>
-            </w:r>
-            <w:r>
-              <w:rPr>
-                <w:rFonts w:ascii="Verdana" w:hAnsi="Verdana" w:cstheme="minorHAnsi"/>
-                <w:b/>
-                <w:bCs/>
-                <w:sz w:val="20"/>
-                <w:szCs w:val="20"/>
-              </w:rPr>
-              <w:t xml:space="preserve">data that </w:t>
-            </w:r>
-            <w:r>
-              <w:rPr>
-                <w:rFonts w:ascii="Verdana" w:hAnsi="Verdana" w:cstheme="minorHAnsi"/>
-                <w:b/>
-                <w:bCs/>
-                <w:sz w:val="20"/>
-                <w:szCs w:val="20"/>
-              </w:rPr>
-              <w:t>identif</w:t>
-            </w:r>
-            <w:r>
-              <w:rPr>
-                <w:rFonts w:ascii="Verdana" w:hAnsi="Verdana" w:cstheme="minorHAnsi"/>
-                <w:b/>
-                <w:bCs/>
-                <w:sz w:val="20"/>
-                <w:szCs w:val="20"/>
-              </w:rPr>
-              <w:t>ies or could</w:t>
-            </w:r>
-            <w:r>
-              <w:rPr>
-                <w:rFonts w:ascii="Verdana" w:hAnsi="Verdana" w:cstheme="minorHAnsi"/>
-                <w:b/>
-                <w:bCs/>
-                <w:sz w:val="20"/>
-                <w:szCs w:val="20"/>
-              </w:rPr>
-              <w:t xml:space="preserve"> identif</w:t>
-            </w:r>
-            <w:r>
-              <w:rPr>
-                <w:rFonts w:ascii="Verdana" w:hAnsi="Verdana" w:cstheme="minorHAnsi"/>
-                <w:b/>
-                <w:bCs/>
-                <w:sz w:val="20"/>
-                <w:szCs w:val="20"/>
-              </w:rPr>
-              <w:t xml:space="preserve">y people </w:t>
-            </w:r>
-            <w:r>
-              <w:rPr>
-                <w:rFonts w:ascii="Verdana" w:hAnsi="Verdana" w:cstheme="minorHAnsi"/>
-                <w:b/>
-                <w:bCs/>
-                <w:sz w:val="20"/>
-                <w:szCs w:val="20"/>
-              </w:rPr>
-              <w:t xml:space="preserve">be destroyed </w:t>
-            </w:r>
-            <w:r>
-              <w:rPr>
-                <w:rFonts w:ascii="Verdana" w:hAnsi="Verdana" w:cstheme="minorHAnsi"/>
-                <w:b/>
-                <w:bCs/>
-                <w:sz w:val="20"/>
-                <w:szCs w:val="20"/>
-              </w:rPr>
-              <w:t>after it has been de-identified</w:t>
-            </w:r>
-            <w:r>
-              <w:rPr>
-                <w:rFonts w:ascii="Verdana" w:hAnsi="Verdana" w:cstheme="minorHAnsi"/>
-                <w:b/>
-                <w:bCs/>
-                <w:sz w:val="20"/>
-                <w:szCs w:val="20"/>
-              </w:rPr>
-              <w:t>?</w:t>
-            </w:r>
-          </w:p>
-          <w:p>
-            <w:pPr>
-              <w:rPr>
-                <w:rFonts w:ascii="Verdana" w:hAnsi="Verdana" w:cstheme="minorHAnsi"/>
-                <w:i/>
-                <w:iCs/>
-                <w:sz w:val="16"/>
-                <w:szCs w:val="16"/>
-              </w:rPr>
-            </w:pPr>
-            <w:r>
-              <w:rPr>
-                <w:rFonts w:ascii="Verdana" w:hAnsi="Verdana" w:cstheme="minorHAnsi"/>
-                <w:i/>
-                <w:iCs/>
-                <w:sz w:val="16"/>
-                <w:szCs w:val="16"/>
-              </w:rPr>
-              <w:t>e.g., will audio recordings be destroyed after they have been transcribed or textual responses had identifying details removed</w:t>
-            </w:r>
-          </w:p>
-          <w:p>
-            <w:pPr>
-              <w:rPr>
-                <w:rFonts w:ascii="Verdana" w:hAnsi="Verdana" w:cstheme="minorHAnsi"/>
-                <w:sz w:val="20"/>
-                <w:szCs w:val="20"/>
-              </w:rPr>
-            </w:pPr>
-          </w:p>
-          <w:p>
-            <w:pPr>
-              <w:rPr>
-                <w:rFonts w:ascii="Verdana" w:hAnsi="Verdana" w:cstheme="minorHAnsi"/>
-                <w:sz w:val="20"/>
-                <w:szCs w:val="20"/>
-              </w:rPr>
-            </w:pPr>
-            <w:sdt>
-              <w:sdtPr>
-                <w:rPr>
-                  <w:rFonts w:ascii="Verdana" w:hAnsi="Verdana" w:cstheme="minorHAnsi"/>
-                  <w:sz w:val="20"/>
-                  <w:szCs w:val="20"/>
-                </w:rPr>
-                <w:id w:val="-1073435287"/>
-                <w14:checkbox>
-                  <w14:checked w14:val="0"/>
-                  <w14:checkedState w14:val="2612" w14:font="MS Gothic"/>
-                  <w14:uncheckedState w14:val="2610" w14:font="MS Gothic"/>
-                </w14:checkbox>
-              </w:sdtPr>
-              <w:sdtContent>
-                <w:r>
-                  <w:rPr>
-                    <w:rFonts w:ascii="MS Gothic" w:eastAsia="MS Gothic" w:hAnsi="MS Gothic" w:cstheme="minorHAnsi" w:hint="eastAsia"/>
-                    <w:sz w:val="20"/>
-                    <w:szCs w:val="20"/>
-                  </w:rPr>
-                  <w:t>☐</w:t>
                 </w:r>
               </w:sdtContent>
             </w:sdt>
@@ -2870,7 +2976,7 @@
                 </w:rPr>
                 <w:id w:val="-531728819"/>
                 <w14:checkbox>
-                  <w14:checked w14:val="1"/>
+                  <w14:checked w14:val="0"/>
                   <w14:checkedState w14:val="2612" w14:font="MS Gothic"/>
                   <w14:uncheckedState w14:val="2610" w14:font="MS Gothic"/>
                 </w14:checkbox>
@@ -2882,7 +2988,7 @@
                     <w:sz w:val="20"/>
                     <w:szCs w:val="20"/>
                   </w:rPr>
-                  <w:t>☒</w:t>
+                  <w:t>☐</w:t>
                 </w:r>
               </w:sdtContent>
             </w:sdt>
@@ -2926,7 +3032,25 @@
                 <w:sz w:val="20"/>
                 <w:szCs w:val="20"/>
               </w:rPr>
-              <w:t>If No please explain why not:</w:t>
+              <w:t xml:space="preserve">If </w:t>
+            </w:r>
+            <w:proofErr w:type="gramStart"/>
+            <w:r>
+              <w:rPr>
+                <w:rFonts w:ascii="Verdana" w:hAnsi="Verdana" w:cstheme="minorHAnsi"/>
+                <w:sz w:val="20"/>
+                <w:szCs w:val="20"/>
+              </w:rPr>
+              <w:t>No</w:t>
+            </w:r>
+            <w:proofErr w:type="gramEnd"/>
+            <w:r>
+              <w:rPr>
+                <w:rFonts w:ascii="Verdana" w:hAnsi="Verdana" w:cstheme="minorHAnsi"/>
+                <w:sz w:val="20"/>
+                <w:szCs w:val="20"/>
+              </w:rPr>
+              <w:t xml:space="preserve"> please explain why not:</w:t>
             </w:r>
           </w:p>
           <w:p>
@@ -3306,7 +3430,25 @@
                 <w:sz w:val="20"/>
                 <w:szCs w:val="20"/>
               </w:rPr>
-              <w:t xml:space="preserve">If Yes specify which special categories of data </w:t>
+              <w:t xml:space="preserve">If </w:t>
+            </w:r>
+            <w:proofErr w:type="gramStart"/>
+            <w:r>
+              <w:rPr>
+                <w:rFonts w:ascii="Verdana" w:hAnsi="Verdana" w:cstheme="minorHAnsi"/>
+                <w:sz w:val="20"/>
+                <w:szCs w:val="20"/>
+              </w:rPr>
+              <w:t>Yes</w:t>
+            </w:r>
+            <w:proofErr w:type="gramEnd"/>
+            <w:r>
+              <w:rPr>
+                <w:rFonts w:ascii="Verdana" w:hAnsi="Verdana" w:cstheme="minorHAnsi"/>
+                <w:sz w:val="20"/>
+                <w:szCs w:val="20"/>
+              </w:rPr>
+              <w:t xml:space="preserve"> specify which special categories of data </w:t>
             </w:r>
             <w:r>
               <w:rPr>
@@ -3657,7 +3799,25 @@
                 <w:sz w:val="20"/>
                 <w:szCs w:val="20"/>
               </w:rPr>
-              <w:t xml:space="preserve">If Yes </w:t>
+              <w:t xml:space="preserve">If </w:t>
+            </w:r>
+            <w:proofErr w:type="gramStart"/>
+            <w:r>
+              <w:rPr>
+                <w:rFonts w:ascii="Verdana" w:hAnsi="Verdana" w:cstheme="minorHAnsi"/>
+                <w:sz w:val="20"/>
+                <w:szCs w:val="20"/>
+              </w:rPr>
+              <w:t>Yes</w:t>
+            </w:r>
+            <w:proofErr w:type="gramEnd"/>
+            <w:r>
+              <w:rPr>
+                <w:rFonts w:ascii="Verdana" w:hAnsi="Verdana" w:cstheme="minorHAnsi"/>
+                <w:sz w:val="20"/>
+                <w:szCs w:val="20"/>
+              </w:rPr>
+              <w:t xml:space="preserve"> </w:t>
             </w:r>
             <w:r>
               <w:rPr>
@@ -3874,7 +4034,25 @@
                 <w:sz w:val="20"/>
                 <w:szCs w:val="20"/>
               </w:rPr>
-              <w:t xml:space="preserve">If Yes please provide the DPIA </w:t>
+              <w:t xml:space="preserve">If </w:t>
+            </w:r>
+            <w:proofErr w:type="gramStart"/>
+            <w:r>
+              <w:rPr>
+                <w:rFonts w:ascii="Verdana" w:hAnsi="Verdana" w:cstheme="minorHAnsi"/>
+                <w:sz w:val="20"/>
+                <w:szCs w:val="20"/>
+              </w:rPr>
+              <w:t>Yes</w:t>
+            </w:r>
+            <w:proofErr w:type="gramEnd"/>
+            <w:r>
+              <w:rPr>
+                <w:rFonts w:ascii="Verdana" w:hAnsi="Verdana" w:cstheme="minorHAnsi"/>
+                <w:sz w:val="20"/>
+                <w:szCs w:val="20"/>
+              </w:rPr>
+              <w:t xml:space="preserve"> please provide the DPIA </w:t>
             </w:r>
             <w:r>
               <w:rPr>
@@ -4104,7 +4282,25 @@
                 <w:sz w:val="20"/>
                 <w:szCs w:val="20"/>
               </w:rPr>
-              <w:t>If Yes p</w:t>
+              <w:t xml:space="preserve">If </w:t>
+            </w:r>
+            <w:proofErr w:type="gramStart"/>
+            <w:r>
+              <w:rPr>
+                <w:rFonts w:ascii="Verdana" w:hAnsi="Verdana" w:cstheme="minorHAnsi"/>
+                <w:sz w:val="20"/>
+                <w:szCs w:val="20"/>
+              </w:rPr>
+              <w:t>Yes</w:t>
+            </w:r>
+            <w:proofErr w:type="gramEnd"/>
+            <w:r>
+              <w:rPr>
+                <w:rFonts w:ascii="Verdana" w:hAnsi="Verdana" w:cstheme="minorHAnsi"/>
+                <w:sz w:val="20"/>
+                <w:szCs w:val="20"/>
+              </w:rPr>
+              <w:t xml:space="preserve"> p</w:t>
             </w:r>
             <w:r>
               <w:rPr>
@@ -4372,7 +4568,25 @@
                 <w:sz w:val="20"/>
                 <w:szCs w:val="20"/>
               </w:rPr>
-              <w:t xml:space="preserve">If Yes </w:t>
+              <w:t xml:space="preserve">If </w:t>
+            </w:r>
+            <w:proofErr w:type="gramStart"/>
+            <w:r>
+              <w:rPr>
+                <w:rFonts w:ascii="Verdana" w:hAnsi="Verdana" w:cstheme="minorHAnsi"/>
+                <w:sz w:val="20"/>
+                <w:szCs w:val="20"/>
+              </w:rPr>
+              <w:t>Yes</w:t>
+            </w:r>
+            <w:proofErr w:type="gramEnd"/>
+            <w:r>
+              <w:rPr>
+                <w:rFonts w:ascii="Verdana" w:hAnsi="Verdana" w:cstheme="minorHAnsi"/>
+                <w:sz w:val="20"/>
+                <w:szCs w:val="20"/>
+              </w:rPr>
+              <w:t xml:space="preserve"> </w:t>
             </w:r>
             <w:r>
               <w:rPr>
@@ -4686,7 +4900,17 @@
                 <w:sz w:val="20"/>
                 <w:szCs w:val="20"/>
               </w:rPr>
-              <w:t>be shared with</w:t>
+              <w:t xml:space="preserve">be shared </w:t>
+            </w:r>
+            <w:proofErr w:type="spellStart"/>
+            <w:proofErr w:type="gramStart"/>
+            <w:r>
+              <w:rPr>
+                <w:rFonts w:ascii="Verdana" w:hAnsi="Verdana" w:cstheme="minorHAnsi"/>
+                <w:sz w:val="20"/>
+                <w:szCs w:val="20"/>
+              </w:rPr>
+              <w:t>with</w:t>
             </w:r>
             <w:r>
               <w:rPr>
@@ -4702,8 +4926,28 @@
                 <w:sz w:val="20"/>
                 <w:szCs w:val="20"/>
               </w:rPr>
-              <w:t>GitHub is private and only authorised users can access the repositry</w:t>
-            </w:r>
+              <w:t>GitHub</w:t>
+            </w:r>
+            <w:proofErr w:type="spellEnd"/>
+            <w:proofErr w:type="gramEnd"/>
+            <w:r>
+              <w:rPr>
+                <w:rFonts w:ascii="Verdana" w:hAnsi="Verdana" w:cstheme="minorHAnsi"/>
+                <w:sz w:val="20"/>
+                <w:szCs w:val="20"/>
+              </w:rPr>
+              <w:t xml:space="preserve"> is private and only authorised users can access the </w:t>
+            </w:r>
+            <w:proofErr w:type="spellStart"/>
+            <w:r>
+              <w:rPr>
+                <w:rFonts w:ascii="Verdana" w:hAnsi="Verdana" w:cstheme="minorHAnsi"/>
+                <w:sz w:val="20"/>
+                <w:szCs w:val="20"/>
+              </w:rPr>
+              <w:t>repositry</w:t>
+            </w:r>
+            <w:proofErr w:type="spellEnd"/>
           </w:p>
           <w:p>
             <w:pPr>
@@ -5025,7 +5269,25 @@
                 <w:sz w:val="20"/>
                 <w:szCs w:val="20"/>
               </w:rPr>
-              <w:t>If No please explain why not:</w:t>
+              <w:t xml:space="preserve">If </w:t>
+            </w:r>
+            <w:proofErr w:type="gramStart"/>
+            <w:r>
+              <w:rPr>
+                <w:rFonts w:ascii="Verdana" w:hAnsi="Verdana" w:cstheme="minorHAnsi"/>
+                <w:sz w:val="20"/>
+                <w:szCs w:val="20"/>
+              </w:rPr>
+              <w:t>No</w:t>
+            </w:r>
+            <w:proofErr w:type="gramEnd"/>
+            <w:r>
+              <w:rPr>
+                <w:rFonts w:ascii="Verdana" w:hAnsi="Verdana" w:cstheme="minorHAnsi"/>
+                <w:sz w:val="20"/>
+                <w:szCs w:val="20"/>
+              </w:rPr>
+              <w:t xml:space="preserve"> please explain why not:</w:t>
             </w:r>
           </w:p>
           <w:p>
@@ -5306,7 +5568,25 @@
                 <w:sz w:val="20"/>
                 <w:szCs w:val="20"/>
               </w:rPr>
-              <w:t xml:space="preserve">If Yes, please describe how they ensure data protection (e.g., copy/paste relevant extracts from their privacy policy, terms and conditions concerning data </w:t>
+              <w:t xml:space="preserve">If </w:t>
+            </w:r>
+            <w:proofErr w:type="gramStart"/>
+            <w:r>
+              <w:rPr>
+                <w:rFonts w:ascii="Verdana" w:hAnsi="Verdana" w:cstheme="minorHAnsi"/>
+                <w:sz w:val="20"/>
+                <w:szCs w:val="20"/>
+              </w:rPr>
+              <w:t>Yes</w:t>
+            </w:r>
+            <w:proofErr w:type="gramEnd"/>
+            <w:r>
+              <w:rPr>
+                <w:rFonts w:ascii="Verdana" w:hAnsi="Verdana" w:cstheme="minorHAnsi"/>
+                <w:sz w:val="20"/>
+                <w:szCs w:val="20"/>
+              </w:rPr>
+              <w:t xml:space="preserve">, please describe how they ensure data protection (e.g., copy/paste relevant extracts from their privacy policy, terms and conditions concerning data </w:t>
             </w:r>
             <w:r>
               <w:rPr>
@@ -6042,6 +6322,7 @@
               </w:rPr>
               <w:t xml:space="preserve">If </w:t>
             </w:r>
+            <w:proofErr w:type="gramStart"/>
             <w:r>
               <w:rPr>
                 <w:rFonts w:ascii="Verdana" w:hAnsi="Verdana" w:cstheme="minorHAnsi"/>
@@ -6049,7 +6330,17 @@
                 <w:sz w:val="20"/>
                 <w:szCs w:val="20"/>
               </w:rPr>
-              <w:t>No the data should not be made available to others, unless clearly gathered for public purposes and consent has been obtained</w:t>
+              <w:t>No</w:t>
+            </w:r>
+            <w:proofErr w:type="gramEnd"/>
+            <w:r>
+              <w:rPr>
+                <w:rFonts w:ascii="Verdana" w:hAnsi="Verdana" w:cstheme="minorHAnsi"/>
+                <w:color w:val="FF0000"/>
+                <w:sz w:val="20"/>
+                <w:szCs w:val="20"/>
+              </w:rPr>
+              <w:t xml:space="preserve"> the data should not be made available to others, unless clearly gathered for public purposes and consent has been obtained</w:t>
             </w:r>
           </w:p>
           <w:p>
@@ -6297,7 +6588,25 @@
                 <w:sz w:val="20"/>
                 <w:szCs w:val="20"/>
               </w:rPr>
-              <w:t xml:space="preserve">If Yes please provide the reference number of the confidentiality agreement signed by the University’s Research Operations team: </w:t>
+              <w:t xml:space="preserve">If </w:t>
+            </w:r>
+            <w:proofErr w:type="gramStart"/>
+            <w:r>
+              <w:rPr>
+                <w:rFonts w:ascii="Verdana" w:hAnsi="Verdana" w:cstheme="minorHAnsi"/>
+                <w:sz w:val="20"/>
+                <w:szCs w:val="20"/>
+              </w:rPr>
+              <w:t>Yes</w:t>
+            </w:r>
+            <w:proofErr w:type="gramEnd"/>
+            <w:r>
+              <w:rPr>
+                <w:rFonts w:ascii="Verdana" w:hAnsi="Verdana" w:cstheme="minorHAnsi"/>
+                <w:sz w:val="20"/>
+                <w:szCs w:val="20"/>
+              </w:rPr>
+              <w:t xml:space="preserve"> please provide the reference number of the confidentiality agreement signed by the University’s Research Operations team: </w:t>
             </w:r>
           </w:p>
           <w:p>

</xml_diff>